<commit_message>
beschrijving update ledstrips en schema's
</commit_message>
<xml_diff>
--- a/InstallatiesBeschrijvingV4.docx
+++ b/InstallatiesBeschrijvingV4.docx
@@ -2374,14 +2374,6 @@
           <w:lang w:val="nl-NL"/>
         </w:rPr>
         <w:t>:</w:t>
-      </w:r>
-      <w:r>
-        <w:rPr>
-          <w:b/>
-          <w:bCs/>
-          <w:lang w:val="nl-NL"/>
-        </w:rPr>
-        <w:br/>
       </w:r>
     </w:p>
     <w:p>

</xml_diff>